<commit_message>
Final version part 1
</commit_message>
<xml_diff>
--- a/Product Vision SEP.docx
+++ b/Product Vision SEP.docx
@@ -220,6 +220,50 @@
               <w:lang w:val="en-US" w:bidi="ru-RU"/>
             </w:rPr>
           </w:pPr>
+          <w:r>
+            <w:rPr>
+              <w:rFonts w:ascii="Times New Roman" w:hAnsi="Times New Roman"/>
+              <w:caps w:val="0"/>
+              <w:color w:val="282660" w:themeColor="text2"/>
+              <w:sz w:val="24"/>
+              <w:szCs w:val="24"/>
+              <w:lang w:val="en-US" w:bidi="ru-RU"/>
+            </w:rPr>
+            <w:t xml:space="preserve">Esme Robertson 20112370, </w:t>
+          </w:r>
+          <w:r>
+            <w:rPr>
+              <w:rFonts w:ascii="Times New Roman" w:hAnsi="Times New Roman"/>
+              <w:caps w:val="0"/>
+              <w:color w:val="282660" w:themeColor="text2"/>
+              <w:sz w:val="24"/>
+              <w:szCs w:val="24"/>
+              <w:lang w:val="en-US" w:bidi="ru-RU"/>
+            </w:rPr>
+            <w:t>Viktoriia Novytska 20117968</w:t>
+          </w:r>
+          <w:r>
+            <w:rPr>
+              <w:rFonts w:ascii="Times New Roman" w:hAnsi="Times New Roman"/>
+              <w:caps w:val="0"/>
+              <w:color w:val="282660" w:themeColor="text2"/>
+              <w:sz w:val="24"/>
+              <w:szCs w:val="24"/>
+              <w:lang w:val="en-US" w:bidi="ru-RU"/>
+            </w:rPr>
+            <w:t xml:space="preserve">, Sean Mattews 20111328, </w:t>
+          </w:r>
+          <w:r>
+            <w:rPr>
+              <w:rFonts w:ascii="Times New Roman" w:hAnsi="Times New Roman"/>
+              <w:caps w:val="0"/>
+              <w:color w:val="282660" w:themeColor="text2"/>
+              <w:sz w:val="24"/>
+              <w:szCs w:val="24"/>
+              <w:lang w:val="en-US" w:bidi="ru-RU"/>
+            </w:rPr>
+            <w:t>Max Burke 20114254</w:t>
+          </w:r>
         </w:p>
         <w:p>
           <w:pPr>
@@ -304,7 +348,43 @@
           <w:bCs/>
           <w:lang w:val="en-US"/>
         </w:rPr>
-        <w:t xml:space="preserve"> project is to design and develop digital platform that improves how students access information about Clubs and Societies in SETU. Our application focuses on increasing student engagement, improving communication and ensuring that information about societies is clear, </w:t>
+        <w:t xml:space="preserve"> project is to design and develop digital </w:t>
+      </w:r>
+      <w:proofErr w:type="gramStart"/>
+      <w:r>
+        <w:rPr>
+          <w:b/>
+          <w:bCs/>
+          <w:lang w:val="en-US"/>
+        </w:rPr>
+        <w:t>platform</w:t>
+      </w:r>
+      <w:proofErr w:type="gramEnd"/>
+      <w:r>
+        <w:rPr>
+          <w:b/>
+          <w:bCs/>
+          <w:lang w:val="en-US"/>
+        </w:rPr>
+        <w:t xml:space="preserve"> that </w:t>
+      </w:r>
+      <w:proofErr w:type="gramStart"/>
+      <w:r>
+        <w:rPr>
+          <w:b/>
+          <w:bCs/>
+          <w:lang w:val="en-US"/>
+        </w:rPr>
+        <w:t>improves</w:t>
+      </w:r>
+      <w:proofErr w:type="gramEnd"/>
+      <w:r>
+        <w:rPr>
+          <w:b/>
+          <w:bCs/>
+          <w:lang w:val="en-US"/>
+        </w:rPr>
+        <w:t xml:space="preserve"> how students access information about Clubs and Societies in SETU. Our application focuses on increasing student engagement, improving communication and ensuring that information about societies is clear, </w:t>
       </w:r>
       <w:proofErr w:type="spellStart"/>
       <w:r>
@@ -387,7 +467,21 @@
         <w:rPr>
           <w:lang w:val="en-US"/>
         </w:rPr>
-        <w:t>The primary users of this application are students of South East Technological University (SETU), including first-year, international,</w:t>
+        <w:t xml:space="preserve">The primary users of this application are students of </w:t>
+      </w:r>
+      <w:proofErr w:type="gramStart"/>
+      <w:r>
+        <w:rPr>
+          <w:lang w:val="en-US"/>
+        </w:rPr>
+        <w:t>South East</w:t>
+      </w:r>
+      <w:proofErr w:type="gramEnd"/>
+      <w:r>
+        <w:rPr>
+          <w:lang w:val="en-US"/>
+        </w:rPr>
+        <w:t xml:space="preserve"> Technological University (SETU), including first-year, international,</w:t>
       </w:r>
       <w:r>
         <w:rPr>
@@ -626,7 +720,21 @@
         <w:rPr>
           <w:lang w:val="en-US"/>
         </w:rPr>
-        <w:t xml:space="preserve">That brings together all club and society information into one </w:t>
+        <w:t xml:space="preserve">That brings together all club and society information </w:t>
+      </w:r>
+      <w:proofErr w:type="gramStart"/>
+      <w:r>
+        <w:rPr>
+          <w:lang w:val="en-US"/>
+        </w:rPr>
+        <w:t>into</w:t>
+      </w:r>
+      <w:proofErr w:type="gramEnd"/>
+      <w:r>
+        <w:rPr>
+          <w:lang w:val="en-US"/>
+        </w:rPr>
+        <w:t xml:space="preserve"> one </w:t>
       </w:r>
       <w:proofErr w:type="spellStart"/>
       <w:r>
@@ -872,7 +980,6 @@
           <w:szCs w:val="28"/>
           <w:lang w:val="en-US"/>
         </w:rPr>
-        <w:lastRenderedPageBreak/>
         <w:t xml:space="preserve">Research of similar applications </w:t>
       </w:r>
       <w:r>
@@ -2501,11 +2608,19 @@
           <w:lang w:val="en-US"/>
         </w:rPr>
       </w:pPr>
-      <w:r>
-        <w:rPr>
-          <w:lang w:val="en-US"/>
-        </w:rPr>
-        <w:t xml:space="preserve">South East Technological University (SETU), 2026. Sports Clubs &amp; Societies – Waterford. Available at: </w:t>
+      <w:proofErr w:type="gramStart"/>
+      <w:r>
+        <w:rPr>
+          <w:lang w:val="en-US"/>
+        </w:rPr>
+        <w:t>South East</w:t>
+      </w:r>
+      <w:proofErr w:type="gramEnd"/>
+      <w:r>
+        <w:rPr>
+          <w:lang w:val="en-US"/>
+        </w:rPr>
+        <w:t xml:space="preserve"> Technological University (SETU), 2026. Sports Clubs &amp; Societies – Waterford. Available at: </w:t>
       </w:r>
       <w:hyperlink r:id="rId12" w:tgtFrame="_new" w:history="1">
         <w:r>

</xml_diff>